<commit_message>
filled in the Version control docs
</commit_message>
<xml_diff>
--- a/Task 2/CalvFletch_VersionControl.docx
+++ b/Task 2/CalvFletch_VersionControl.docx
@@ -155,10 +155,9 @@
     <w:sdt>
       <w:sdtPr>
         <w:rPr>
-          <w:color w:val="FF0000"/>
+          <w:noProof/>
         </w:rPr>
         <w:id w:val="-689141140"/>
-        <w:showingPlcHdr/>
         <w:picture/>
       </w:sdtPr>
       <w:sdtContent>
@@ -171,13 +170,12 @@
           <w:r>
             <w:rPr>
               <w:noProof/>
-              <w:color w:val="FF0000"/>
             </w:rPr>
             <w:drawing>
-              <wp:inline distT="0" distB="0" distL="0" distR="0" wp14:anchorId="19E5D10A" wp14:editId="1E80A3EE">
-                <wp:extent cx="1908175" cy="1908175"/>
+              <wp:inline distT="0" distB="0" distL="0" distR="0" wp14:anchorId="645F010F" wp14:editId="24CCB2E8">
+                <wp:extent cx="4215325" cy="2100943"/>
                 <wp:effectExtent l="0" t="0" r="0" b="0"/>
-                <wp:docPr id="141050462" name="Picture 1"/>
+                <wp:docPr id="1113106339" name="Picture 1"/>
                 <wp:cNvGraphicFramePr>
                   <a:graphicFrameLocks xmlns:a="http://schemas.openxmlformats.org/drawingml/2006/main" noChangeAspect="1"/>
                 </wp:cNvGraphicFramePr>
@@ -185,36 +183,23 @@
                   <a:graphicData uri="http://schemas.openxmlformats.org/drawingml/2006/picture">
                     <pic:pic xmlns:pic="http://schemas.openxmlformats.org/drawingml/2006/picture">
                       <pic:nvPicPr>
-                        <pic:cNvPr id="0" name="Picture 1"/>
-                        <pic:cNvPicPr>
-                          <a:picLocks noChangeAspect="1" noChangeArrowheads="1"/>
-                        </pic:cNvPicPr>
+                        <pic:cNvPr id="1113106339" name=""/>
+                        <pic:cNvPicPr/>
                       </pic:nvPicPr>
                       <pic:blipFill>
-                        <a:blip r:embed="rId9">
-                          <a:extLst>
-                            <a:ext uri="{28A0092B-C50C-407E-A947-70E740481C1C}">
-                              <a14:useLocalDpi xmlns:a14="http://schemas.microsoft.com/office/drawing/2010/main" val="0"/>
-                            </a:ext>
-                          </a:extLst>
-                        </a:blip>
-                        <a:srcRect/>
+                        <a:blip r:embed="rId9"/>
                         <a:stretch>
                           <a:fillRect/>
                         </a:stretch>
                       </pic:blipFill>
-                      <pic:spPr bwMode="auto">
+                      <pic:spPr>
                         <a:xfrm>
                           <a:off x="0" y="0"/>
-                          <a:ext cx="1908175" cy="1908175"/>
+                          <a:ext cx="4249815" cy="2118133"/>
                         </a:xfrm>
                         <a:prstGeom prst="rect">
                           <a:avLst/>
                         </a:prstGeom>
-                        <a:noFill/>
-                        <a:ln>
-                          <a:noFill/>
-                        </a:ln>
                       </pic:spPr>
                     </pic:pic>
                   </a:graphicData>
@@ -246,21 +231,16 @@
           <w:placeholder>
             <w:docPart w:val="055B7ABDC6594D37A2D105E64730DB39"/>
           </w:placeholder>
-          <w:showingPlcHdr/>
         </w:sdtPr>
         <w:sdtContent>
-          <w:r>
-            <w:rPr>
-              <w:rStyle w:val="PlaceholderText"/>
-            </w:rPr>
-            <w:t>Paste your link here</w:t>
-          </w:r>
-          <w:r>
-            <w:rPr>
-              <w:rStyle w:val="PlaceholderText"/>
-            </w:rPr>
-            <w:t>.</w:t>
-          </w:r>
+          <w:hyperlink r:id="rId10" w:history="1">
+            <w:r>
+              <w:rPr>
+                <w:rStyle w:val="Hyperlink"/>
+              </w:rPr>
+              <w:t>https://github.com/CalvFletch/02-Introduction-to-Cpp/commit/b596f177cb77466389e1505d52034cbcbda9a236</w:t>
+            </w:r>
+          </w:hyperlink>
         </w:sdtContent>
       </w:sdt>
     </w:p>
@@ -271,8 +251,10 @@
     </w:p>
     <w:sdt>
       <w:sdtPr>
+        <w:rPr>
+          <w:noProof/>
+        </w:rPr>
         <w:id w:val="557513381"/>
-        <w:showingPlcHdr/>
         <w:picture/>
       </w:sdtPr>
       <w:sdtContent>
@@ -282,10 +264,10 @@
               <w:noProof/>
             </w:rPr>
             <w:drawing>
-              <wp:inline distT="0" distB="0" distL="0" distR="0" wp14:anchorId="22E43F4B" wp14:editId="19D72A45">
-                <wp:extent cx="1908175" cy="1908175"/>
-                <wp:effectExtent l="0" t="0" r="0" b="0"/>
-                <wp:docPr id="2" name="Picture 1"/>
+              <wp:inline distT="0" distB="0" distL="0" distR="0" wp14:anchorId="702A4C1D" wp14:editId="01785F05">
+                <wp:extent cx="4356975" cy="2692400"/>
+                <wp:effectExtent l="0" t="0" r="5715" b="0"/>
+                <wp:docPr id="201507823" name="Picture 1"/>
                 <wp:cNvGraphicFramePr>
                   <a:graphicFrameLocks xmlns:a="http://schemas.openxmlformats.org/drawingml/2006/main" noChangeAspect="1"/>
                 </wp:cNvGraphicFramePr>
@@ -293,36 +275,23 @@
                   <a:graphicData uri="http://schemas.openxmlformats.org/drawingml/2006/picture">
                     <pic:pic xmlns:pic="http://schemas.openxmlformats.org/drawingml/2006/picture">
                       <pic:nvPicPr>
-                        <pic:cNvPr id="0" name="Picture 2"/>
-                        <pic:cNvPicPr>
-                          <a:picLocks noChangeAspect="1" noChangeArrowheads="1"/>
-                        </pic:cNvPicPr>
+                        <pic:cNvPr id="201507823" name=""/>
+                        <pic:cNvPicPr/>
                       </pic:nvPicPr>
                       <pic:blipFill>
-                        <a:blip r:embed="rId9">
-                          <a:extLst>
-                            <a:ext uri="{28A0092B-C50C-407E-A947-70E740481C1C}">
-                              <a14:useLocalDpi xmlns:a14="http://schemas.microsoft.com/office/drawing/2010/main" val="0"/>
-                            </a:ext>
-                          </a:extLst>
-                        </a:blip>
-                        <a:srcRect/>
+                        <a:blip r:embed="rId11"/>
                         <a:stretch>
                           <a:fillRect/>
                         </a:stretch>
                       </pic:blipFill>
-                      <pic:spPr bwMode="auto">
+                      <pic:spPr>
                         <a:xfrm>
                           <a:off x="0" y="0"/>
-                          <a:ext cx="1908175" cy="1908175"/>
+                          <a:ext cx="4361597" cy="2695256"/>
                         </a:xfrm>
                         <a:prstGeom prst="rect">
                           <a:avLst/>
                         </a:prstGeom>
-                        <a:noFill/>
-                        <a:ln>
-                          <a:noFill/>
-                        </a:ln>
                       </pic:spPr>
                     </pic:pic>
                   </a:graphicData>
@@ -354,20 +323,10 @@
           <w:placeholder>
             <w:docPart w:val="06FA6E0C26384CDB9A726F9B1A964BC1"/>
           </w:placeholder>
-          <w:showingPlcHdr/>
         </w:sdtPr>
         <w:sdtContent>
           <w:r>
-            <w:rPr>
-              <w:rStyle w:val="PlaceholderText"/>
-            </w:rPr>
-            <w:t>Paste your link here</w:t>
-          </w:r>
-          <w:r>
-            <w:rPr>
-              <w:rStyle w:val="PlaceholderText"/>
-            </w:rPr>
-            <w:t>.</w:t>
+            <w:t>https://github.com/CalvFletch/02-Introduction-to-Cpp/pull/1</w:t>
           </w:r>
         </w:sdtContent>
       </w:sdt>
@@ -379,8 +338,10 @@
     </w:p>
     <w:sdt>
       <w:sdtPr>
+        <w:rPr>
+          <w:noProof/>
+        </w:rPr>
         <w:id w:val="510805452"/>
-        <w:showingPlcHdr/>
         <w:picture/>
       </w:sdtPr>
       <w:sdtContent>
@@ -390,10 +351,10 @@
               <w:noProof/>
             </w:rPr>
             <w:drawing>
-              <wp:inline distT="0" distB="0" distL="0" distR="0" wp14:anchorId="737A30FF" wp14:editId="4B5F74B4">
-                <wp:extent cx="1908175" cy="1908175"/>
-                <wp:effectExtent l="0" t="0" r="0" b="0"/>
-                <wp:docPr id="828644952" name="Picture 1"/>
+              <wp:inline distT="0" distB="0" distL="0" distR="0" wp14:anchorId="5165855E" wp14:editId="3EBA4004">
+                <wp:extent cx="4224270" cy="2743200"/>
+                <wp:effectExtent l="0" t="0" r="5080" b="0"/>
+                <wp:docPr id="758458080" name="Picture 1"/>
                 <wp:cNvGraphicFramePr>
                   <a:graphicFrameLocks xmlns:a="http://schemas.openxmlformats.org/drawingml/2006/main" noChangeAspect="1"/>
                 </wp:cNvGraphicFramePr>
@@ -401,36 +362,23 @@
                   <a:graphicData uri="http://schemas.openxmlformats.org/drawingml/2006/picture">
                     <pic:pic xmlns:pic="http://schemas.openxmlformats.org/drawingml/2006/picture">
                       <pic:nvPicPr>
-                        <pic:cNvPr id="0" name="Picture 1"/>
-                        <pic:cNvPicPr>
-                          <a:picLocks noChangeAspect="1" noChangeArrowheads="1"/>
-                        </pic:cNvPicPr>
+                        <pic:cNvPr id="1559547337" name=""/>
+                        <pic:cNvPicPr/>
                       </pic:nvPicPr>
                       <pic:blipFill>
-                        <a:blip r:embed="rId9">
-                          <a:extLst>
-                            <a:ext uri="{28A0092B-C50C-407E-A947-70E740481C1C}">
-                              <a14:useLocalDpi xmlns:a14="http://schemas.microsoft.com/office/drawing/2010/main" val="0"/>
-                            </a:ext>
-                          </a:extLst>
-                        </a:blip>
-                        <a:srcRect/>
+                        <a:blip r:embed="rId12"/>
                         <a:stretch>
                           <a:fillRect/>
                         </a:stretch>
                       </pic:blipFill>
-                      <pic:spPr bwMode="auto">
+                      <pic:spPr>
                         <a:xfrm>
                           <a:off x="0" y="0"/>
-                          <a:ext cx="1908175" cy="1908175"/>
+                          <a:ext cx="4233693" cy="2749319"/>
                         </a:xfrm>
                         <a:prstGeom prst="rect">
                           <a:avLst/>
                         </a:prstGeom>
-                        <a:noFill/>
-                        <a:ln>
-                          <a:noFill/>
-                        </a:ln>
                       </pic:spPr>
                     </pic:pic>
                   </a:graphicData>
@@ -493,21 +441,16 @@
           <w:placeholder>
             <w:docPart w:val="488E6452A82840BEA2A8DC1C6D0A2014"/>
           </w:placeholder>
-          <w:showingPlcHdr/>
         </w:sdtPr>
         <w:sdtContent>
-          <w:r>
-            <w:rPr>
-              <w:rStyle w:val="PlaceholderText"/>
-            </w:rPr>
-            <w:t>Paste your link here</w:t>
-          </w:r>
-          <w:r>
-            <w:rPr>
-              <w:rStyle w:val="PlaceholderText"/>
-            </w:rPr>
-            <w:t>.</w:t>
-          </w:r>
+          <w:hyperlink r:id="rId13" w:history="1">
+            <w:r>
+              <w:rPr>
+                <w:rStyle w:val="Hyperlink"/>
+              </w:rPr>
+              <w:t>https://www.udemy.com/course/learn-cpp-for-ue4-unit-1/</w:t>
+            </w:r>
+          </w:hyperlink>
         </w:sdtContent>
       </w:sdt>
     </w:p>
@@ -764,15 +707,19 @@
         <w:placeholder>
           <w:docPart w:val="DefaultPlaceholder_-1854013440"/>
         </w:placeholder>
-        <w:showingPlcHdr/>
       </w:sdtPr>
       <w:sdtContent>
         <w:p>
           <w:r>
-            <w:rPr>
-              <w:rStyle w:val="PlaceholderText"/>
-            </w:rPr>
-            <w:t>Click or tap here to enter text.</w:t>
+            <w:t xml:space="preserve">I’ve noticed that I am too slow at getting code written out. I find myself looking at the keyboard a bit too much. I know what I want written, but the time it takes to actually achieve what I have in my head was starting to make things feel clunky while typing, so I decided to setup some vim bindings and start learning vim as it feels like I can achieve a bit more satisfying of a turn around with this approach. </w:t>
+          </w:r>
+        </w:p>
+        <w:p>
+          <w:r>
+            <w:t xml:space="preserve">I have only recently actually been using git version control (past 4 months) and since starting in visual studio instead of visual studio code, I find all the extensions and methods I was using before had vanished due to it being a completely different IDE. </w:t>
+          </w:r>
+          <w:r>
+            <w:t>Even though git was the same. So instead, I learned what I needed through using git through the console instead. Where I know that my knowledge of it will essentially always be the same no matter the environment.</w:t>
           </w:r>
         </w:p>
       </w:sdtContent>
@@ -851,31 +798,43 @@
         <w:placeholder>
           <w:docPart w:val="DefaultPlaceholder_-1854013440"/>
         </w:placeholder>
-        <w:showingPlcHdr/>
       </w:sdtPr>
       <w:sdtContent>
+        <w:p>
+          <w:r>
+            <w:t>I think I often held off making commits until I felt like I had “completed” something</w:t>
+          </w:r>
+          <w:r>
+            <w:t xml:space="preserve">. I’ve been used to working in python in git where it is a lot easier to keep committing something stable, it makes me forget that the biggest benefit it being able to track and return to previous states. </w:t>
+          </w:r>
+          <w:r>
+            <w:br/>
+            <w:t>I think I need to find a way to do some kind of auto commit mode, or at least something that prompts me to make a commit after changing a certain amount of information.</w:t>
+          </w:r>
+        </w:p>
         <w:p>
           <w:pPr>
             <w:rPr>
               <w:color w:val="808080"/>
             </w:rPr>
           </w:pPr>
-          <w:r>
+        </w:p>
+        <w:p>
+          <w:pPr>
             <w:rPr>
-              <w:rStyle w:val="PlaceholderText"/>
+              <w:color w:val="808080"/>
             </w:rPr>
-            <w:t>Click or tap here to enter text.</w:t>
-          </w:r>
+          </w:pPr>
         </w:p>
       </w:sdtContent>
     </w:sdt>
     <w:sectPr>
-      <w:headerReference w:type="even" r:id="rId10"/>
-      <w:headerReference w:type="default" r:id="rId11"/>
-      <w:footerReference w:type="even" r:id="rId12"/>
-      <w:footerReference w:type="default" r:id="rId13"/>
-      <w:headerReference w:type="first" r:id="rId14"/>
-      <w:footerReference w:type="first" r:id="rId15"/>
+      <w:headerReference w:type="even" r:id="rId14"/>
+      <w:headerReference w:type="default" r:id="rId15"/>
+      <w:footerReference w:type="even" r:id="rId16"/>
+      <w:footerReference w:type="default" r:id="rId17"/>
+      <w:headerReference w:type="first" r:id="rId18"/>
+      <w:footerReference w:type="first" r:id="rId19"/>
       <w:pgSz w:w="11906" w:h="16838"/>
       <w:pgMar w:top="1440" w:right="1440" w:bottom="1440" w:left="1440" w:header="170" w:footer="708" w:gutter="0"/>
       <w:cols w:space="708"/>
@@ -3239,6 +3198,18 @@
     <w:rPr>
       <w:color w:val="605E5C"/>
       <w:shd w:val="clear" w:color="auto" w:fill="E1DFDD"/>
+    </w:rPr>
+  </w:style>
+  <w:style w:type="character" w:styleId="FollowedHyperlink">
+    <w:name w:val="FollowedHyperlink"/>
+    <w:basedOn w:val="DefaultParagraphFont"/>
+    <w:uiPriority w:val="99"/>
+    <w:semiHidden/>
+    <w:unhideWhenUsed/>
+    <w:rsid w:val="00926F82"/>
+    <w:rPr>
+      <w:color w:val="800080" w:themeColor="followedHyperlink"/>
+      <w:u w:val="single"/>
     </w:rPr>
   </w:style>
 </w:styles>
@@ -3709,8 +3680,10 @@
     <w:rsidRoot w:val="00D1226A"/>
     <w:rsid w:val="004C757D"/>
     <w:rsid w:val="00B56AD6"/>
+    <w:rsid w:val="00CE4516"/>
     <w:rsid w:val="00D1226A"/>
     <w:rsid w:val="00E95A42"/>
+    <w:rsid w:val="00F1001F"/>
   </w:rsids>
   <m:mathPr>
     <m:mathFont m:val="Cambria Math"/>

</xml_diff>